<commit_message>
🐛 fix: fixed templates with missing data
</commit_message>
<xml_diff>
--- a/apps/web/templates/NomadDocs/Lease Agreement.docx
+++ b/apps/web/templates/NomadDocs/Lease Agreement.docx
@@ -2601,7 +2601,6 @@
                 <w:bCs/>
                 <w:sz w:val="20"/>
                 <w:szCs w:val="20"/>
-                <w:highlight w:val="none"/>
               </w:rPr>
             </w:r>
             <w:r>
@@ -2625,7 +2624,7 @@
                 <w:bCs/>
                 <w:sz w:val="20"/>
                 <w:szCs w:val="20"/>
-                <w:highlight w:val="none"/>
+                <w:lang w:val="en-US"/>
               </w:rPr>
             </w:pPr>
             <w:r>
@@ -2708,7 +2707,108 @@
                 <w:szCs w:val="20"/>
                 <w:lang w:val="en-US"/>
               </w:rPr>
+            </w:r>
+            <w:r>
+              <w:rPr>
+                <w:rFonts w:ascii="Times New Roman" w:hAnsi="Times New Roman" w:eastAsia="Times New Roman" w:cs="Times New Roman"/>
+                <w:b/>
+                <w:bCs/>
+                <w:sz w:val="20"/>
+                <w:szCs w:val="20"/>
+                <w:highlight w:val="none"/>
+              </w:rPr>
+            </w:r>
+          </w:p>
+          <w:p>
+            <w:pPr>
+              <w:pBdr/>
+              <w:spacing/>
+              <w:ind w:right="322"/>
+              <w:rPr>
+                <w:rFonts w:ascii="Times New Roman" w:hAnsi="Times New Roman" w:eastAsia="Times New Roman" w:cs="Times New Roman"/>
+                <w:b/>
+                <w:bCs/>
+                <w:sz w:val="20"/>
+                <w:szCs w:val="20"/>
+                <w:highlight w:val="none"/>
+              </w:rPr>
+            </w:pPr>
+            <w:r>
+              <w:rPr>
+                <w:rFonts w:ascii="Times New Roman" w:hAnsi="Times New Roman" w:eastAsia="Times New Roman" w:cs="Times New Roman"/>
+                <w:b/>
+                <w:bCs/>
+                <w:sz w:val="20"/>
+                <w:szCs w:val="20"/>
+                <w:lang w:val="ru-RU"/>
+              </w:rPr>
+              <w:t xml:space="preserve">г</w:t>
+            </w:r>
+            <w:r>
+              <w:rPr>
+                <w:rFonts w:ascii="Times New Roman" w:hAnsi="Times New Roman" w:eastAsia="Times New Roman" w:cs="Times New Roman"/>
+                <w:b/>
+                <w:bCs/>
+                <w:sz w:val="20"/>
+                <w:szCs w:val="20"/>
+                <w:lang w:val="en-US"/>
+              </w:rPr>
+              <w:t xml:space="preserve">.</w:t>
+            </w:r>
+            <w:r>
+              <w:rPr>
+                <w:rFonts w:ascii="Times New Roman" w:hAnsi="Times New Roman" w:eastAsia="Times New Roman" w:cs="Times New Roman"/>
+                <w:b/>
+                <w:bCs/>
+                <w:sz w:val="20"/>
+                <w:szCs w:val="20"/>
+                <w:lang w:val="en-US"/>
+              </w:rPr>
               <w:t xml:space="preserve">{</w:t>
+            </w:r>
+            <w:r>
+              <w:rPr>
+                <w:rFonts w:ascii="Times New Roman" w:hAnsi="Times New Roman" w:eastAsia="Times New Roman" w:cs="Times New Roman"/>
+                <w:b/>
+                <w:bCs/>
+                <w:sz w:val="20"/>
+                <w:szCs w:val="20"/>
+                <w:lang w:val="en-US"/>
+              </w:rPr>
+              <w:t xml:space="preserve">organization.</w:t>
+            </w:r>
+            <w:r>
+              <w:rPr>
+                <w:rFonts w:ascii="Times New Roman" w:hAnsi="Times New Roman" w:eastAsia="Times New Roman" w:cs="Times New Roman"/>
+                <w:b/>
+                <w:bCs/>
+                <w:sz w:val="20"/>
+                <w:szCs w:val="20"/>
+                <w:lang w:val="en-US"/>
+              </w:rPr>
+              <w:t xml:space="preserve">city}, {</w:t>
+            </w:r>
+            <w:r>
+              <w:rPr>
+                <w:rFonts w:ascii="Times New Roman" w:hAnsi="Times New Roman" w:eastAsia="Times New Roman" w:cs="Times New Roman"/>
+                <w:b/>
+                <w:bCs/>
+                <w:sz w:val="20"/>
+                <w:szCs w:val="20"/>
+                <w:lang w:val="en-US"/>
+              </w:rPr>
+              <w:t xml:space="preserve">organization.</w:t>
+            </w:r>
+            <w:r>
+              <w:rPr>
+                <w:rFonts w:ascii="Times New Roman" w:hAnsi="Times New Roman" w:eastAsia="Times New Roman" w:cs="Times New Roman"/>
+                <w:b/>
+                <w:bCs/>
+                <w:sz w:val="20"/>
+                <w:szCs w:val="20"/>
+                <w:lang w:val="en-US"/>
+              </w:rPr>
+              <w:t xml:space="preserve">index}, {</w:t>
             </w:r>
             <w:r>
               <w:rPr>
@@ -2758,18 +2858,10 @@
                 <w:bCs/>
                 <w:sz w:val="20"/>
                 <w:szCs w:val="20"/>
-              </w:rPr>
-            </w:r>
-            <w:r>
-              <w:rPr>
-                <w:rFonts w:ascii="Times New Roman" w:hAnsi="Times New Roman" w:eastAsia="Times New Roman" w:cs="Times New Roman"/>
-                <w:b/>
-                <w:bCs/>
-                <w:sz w:val="20"/>
-                <w:szCs w:val="20"/>
                 <w:highlight w:val="none"/>
               </w:rPr>
             </w:r>
+            <w:r/>
           </w:p>
           <w:p>
             <w:pPr>
@@ -35674,7 +35766,7 @@
     <customSectPr/>
   </customSectProps>
   <customShpExts>
-    <customShpInfo spid="_x005F_x005F_x005F_x0000_s1026" textRotate="1"/>
+    <customShpInfo spid="_x005F_x005F_x005F_x005F_x005F_x005F_x005F_x0000_s1026" textRotate="1"/>
   </customShpExts>
 </s:customData>
 </file>

</xml_diff>

<commit_message>
🔧 chore: changed the type of costPerDay to numeric & optimized deploy pipline
</commit_message>
<xml_diff>
--- a/apps/web/templates/NomadDocs/Lease Agreement.docx
+++ b/apps/web/templates/NomadDocs/Lease Agreement.docx
@@ -1120,7 +1120,7 @@
           <w:color w:val="000000"/>
           <w:lang w:val="en-US"/>
         </w:rPr>
-        <w:t xml:space="preserve">{totalPrice}</w:t>
+        <w:t xml:space="preserve">{totalCost}</w:t>
       </w:r>
       <w:r>
         <w:rPr>
@@ -1149,7 +1149,7 @@
           <w:color w:val="000000"/>
           <w:lang w:val="en-US"/>
         </w:rPr>
-        <w:t xml:space="preserve">{totalPriceRu}</w:t>
+        <w:t xml:space="preserve">{totalCostRu}</w:t>
       </w:r>
       <w:r>
         <w:rPr>
@@ -2705,7 +2705,7 @@
                 <w:bCs/>
                 <w:sz w:val="20"/>
                 <w:szCs w:val="20"/>
-                <w:lang w:val="en-US"/>
+                <w:highlight w:val="none"/>
               </w:rPr>
             </w:r>
             <w:r>
@@ -2715,7 +2715,7 @@
                 <w:bCs/>
                 <w:sz w:val="20"/>
                 <w:szCs w:val="20"/>
-                <w:highlight w:val="none"/>
+                <w:lang w:val="en-US"/>
               </w:rPr>
             </w:r>
           </w:p>
@@ -2861,7 +2861,16 @@
                 <w:highlight w:val="none"/>
               </w:rPr>
             </w:r>
-            <w:r/>
+            <w:r>
+              <w:rPr>
+                <w:rFonts w:ascii="Times New Roman" w:hAnsi="Times New Roman" w:eastAsia="Times New Roman" w:cs="Times New Roman"/>
+                <w:b/>
+                <w:bCs/>
+                <w:sz w:val="20"/>
+                <w:szCs w:val="20"/>
+                <w:highlight w:val="none"/>
+              </w:rPr>
+            </w:r>
           </w:p>
           <w:p>
             <w:pPr>
@@ -35766,7 +35775,7 @@
     <customSectPr/>
   </customSectProps>
   <customShpExts>
-    <customShpInfo spid="_x005F_x005F_x005F_x005F_x005F_x005F_x005F_x0000_s1026" textRotate="1"/>
+    <customShpInfo spid="_x005F_x005F_x005F_x005F_x005F_x005F_x005F_x005F_x005F_x005F_x005F_x005F_x005F_x005F_x005F_x0000_s1026" textRotate="1"/>
   </customShpExts>
 </s:customData>
 </file>

</xml_diff>

<commit_message>
🐛 fix: fixed Lease Agreement template for nomaddocs
</commit_message>
<xml_diff>
--- a/apps/web/templates/NomadDocs/Lease Agreement.docx
+++ b/apps/web/templates/NomadDocs/Lease Agreement.docx
@@ -956,7 +956,7 @@
           <w:b w:val="0"/>
           <w:lang w:val="en-US"/>
         </w:rPr>
-        <w:t xml:space="preserve">organization</w:t>
+        <w:t xml:space="preserve">customer.organization</w:t>
       </w:r>
       <w:r>
         <w:rPr>
@@ -1120,7 +1120,23 @@
           <w:color w:val="000000"/>
           <w:lang w:val="en-US"/>
         </w:rPr>
-        <w:t xml:space="preserve">{totalCost}</w:t>
+        <w:t xml:space="preserve">{</w:t>
+      </w:r>
+      <w:r>
+        <w:rPr>
+          <w:rFonts w:ascii="Times New Roman" w:hAnsi="Times New Roman" w:eastAsia="Times New Roman" w:cs="Times New Roman"/>
+          <w:color w:val="000000"/>
+          <w:lang w:val="en-US"/>
+        </w:rPr>
+        <w:t xml:space="preserve">totalCost</w:t>
+      </w:r>
+      <w:r>
+        <w:rPr>
+          <w:rFonts w:ascii="Times New Roman" w:hAnsi="Times New Roman" w:eastAsia="Times New Roman" w:cs="Times New Roman"/>
+          <w:color w:val="000000"/>
+          <w:lang w:val="en-US"/>
+        </w:rPr>
+        <w:t xml:space="preserve">}</w:t>
       </w:r>
       <w:r>
         <w:rPr>
@@ -2550,7 +2566,16 @@
                 <w:highlight w:val="none"/>
                 <w:lang w:val="en-US"/>
               </w:rPr>
-              <w:t xml:space="preserve">{</w:t>
+            </w:r>
+            <w:r>
+              <w:rPr>
+                <w:rFonts w:hint="default" w:ascii="Times New Roman" w:hAnsi="Times New Roman"/>
+                <w:b/>
+                <w:sz w:val="20"/>
+                <w:szCs w:val="20"/>
+                <w:lang w:val="en-US"/>
+              </w:rPr>
+              <w:t xml:space="preserve">{customer.</w:t>
             </w:r>
             <w:r>
               <w:rPr>
@@ -2584,12 +2609,10 @@
             </w:r>
             <w:r>
               <w:rPr>
-                <w:rFonts w:ascii="Times New Roman" w:hAnsi="Times New Roman" w:eastAsia="Times New Roman" w:cs="Times New Roman"/>
+                <w:rFonts w:hint="default" w:ascii="Times New Roman" w:hAnsi="Times New Roman"/>
                 <w:b/>
-                <w:bCs/>
                 <w:sz w:val="20"/>
                 <w:szCs w:val="20"/>
-                <w:highlight w:val="none"/>
                 <w:lang w:val="en-US"/>
               </w:rPr>
               <w:t xml:space="preserve">}</w:t>
@@ -2655,7 +2678,7 @@
                 <w:szCs w:val="20"/>
                 <w:lang w:val="en-US"/>
               </w:rPr>
-              <w:t xml:space="preserve">{</w:t>
+              <w:t xml:space="preserve">{customer.</w:t>
             </w:r>
             <w:r>
               <w:rPr>
@@ -2705,7 +2728,7 @@
                 <w:bCs/>
                 <w:sz w:val="20"/>
                 <w:szCs w:val="20"/>
-                <w:highlight w:val="none"/>
+                <w:lang w:val="en-US"/>
               </w:rPr>
             </w:r>
             <w:r>
@@ -2764,7 +2787,7 @@
                 <w:szCs w:val="20"/>
                 <w:lang w:val="en-US"/>
               </w:rPr>
-              <w:t xml:space="preserve">{</w:t>
+              <w:t xml:space="preserve">{customer.</w:t>
             </w:r>
             <w:r>
               <w:rPr>
@@ -2786,7 +2809,7 @@
                 <w:szCs w:val="20"/>
                 <w:lang w:val="en-US"/>
               </w:rPr>
-              <w:t xml:space="preserve">city}, {</w:t>
+              <w:t xml:space="preserve">city}, {customer.</w:t>
             </w:r>
             <w:r>
               <w:rPr>
@@ -2808,7 +2831,7 @@
                 <w:szCs w:val="20"/>
                 <w:lang w:val="en-US"/>
               </w:rPr>
-              <w:t xml:space="preserve">index}, {</w:t>
+              <w:t xml:space="preserve">index}, {customer.</w:t>
             </w:r>
             <w:r>
               <w:rPr>
@@ -2892,19 +2915,9 @@
                 <w:bCs/>
                 <w:sz w:val="20"/>
                 <w:szCs w:val="20"/>
-              </w:rPr>
-              <w:t xml:space="preserve">почтовый индекс</w:t>
-            </w:r>
-            <w:r>
-              <w:rPr>
-                <w:rFonts w:ascii="Times New Roman" w:hAnsi="Times New Roman" w:eastAsia="Times New Roman" w:cs="Times New Roman"/>
-                <w:b/>
-                <w:bCs/>
-                <w:sz w:val="20"/>
-                <w:szCs w:val="20"/>
                 <w:lang w:val="en-US"/>
               </w:rPr>
-              <w:t xml:space="preserve"> {</w:t>
+              <w:t xml:space="preserve">{customer.</w:t>
             </w:r>
             <w:r>
               <w:rPr>
@@ -35775,7 +35788,7 @@
     <customSectPr/>
   </customSectProps>
   <customShpExts>
-    <customShpInfo spid="_x005F_x005F_x005F_x005F_x005F_x005F_x005F_x005F_x005F_x005F_x005F_x005F_x005F_x005F_x005F_x0000_s1026" textRotate="1"/>
+    <customShpInfo spid="_x005F_x005F_x005F_x005F_x005F_x005F_x005F_x005F_x005F_x005F_x005F_x005F_x005F_x005F_x005F_x005F_x005F_x005F_x005F_x005F_x005F_x005F_x005F_x005F_x005F_x005F_x005F_x005F_x005F_x005F_x005F_x005F_x005F_x005F_x005F_x005F_x005F_x005F_x005F_x005F_x005F_x005F_x005F_x005F_x005F_x005F_x005F_x005F_x005F_x005F_x005F_x005F_x005F_x005F_x005F_x005F_x005F_x005F_x005F_x005F_x005F_x005F_x005F_x0000_s1026" textRotate="1"/>
   </customShpExts>
 </s:customData>
 </file>

</xml_diff>

<commit_message>
✨ feat: added support float type for cost
</commit_message>
<xml_diff>
--- a/apps/web/templates/NomadDocs/Lease Agreement.docx
+++ b/apps/web/templates/NomadDocs/Lease Agreement.docx
@@ -1008,7 +1008,22 @@
           <w:rFonts w:ascii="Times New Roman" w:hAnsi="Times New Roman" w:eastAsia="Times New Roman" w:cs="Times New Roman"/>
           <w:color w:val="000000"/>
         </w:rPr>
-        <w:t xml:space="preserve"> тенге) тенге 00 </w:t>
+        <w:t xml:space="preserve"> тенге) тенге</w:t>
+      </w:r>
+      <w:r>
+        <w:rPr>
+          <w:rFonts w:ascii="Times New Roman" w:hAnsi="Times New Roman" w:eastAsia="Times New Roman" w:cs="Times New Roman"/>
+          <w:color w:val="000000"/>
+          <w:lang w:val="en-US"/>
+        </w:rPr>
+        <w:t xml:space="preserve">{costPerDayCents}</w:t>
+      </w:r>
+      <w:r>
+        <w:rPr>
+          <w:rFonts w:ascii="Times New Roman" w:hAnsi="Times New Roman" w:eastAsia="Times New Roman" w:cs="Times New Roman"/>
+          <w:color w:val="000000"/>
+        </w:rPr>
+        <w:t xml:space="preserve"> </w:t>
       </w:r>
       <w:r>
         <w:rPr>
@@ -1180,7 +1195,22 @@
           <w:rFonts w:ascii="Times New Roman" w:hAnsi="Times New Roman" w:eastAsia="Times New Roman" w:cs="Times New Roman"/>
           <w:color w:val="000000"/>
         </w:rPr>
-        <w:t xml:space="preserve">) тенге 00 </w:t>
+        <w:t xml:space="preserve">) тенге</w:t>
+      </w:r>
+      <w:r>
+        <w:rPr>
+          <w:rFonts w:ascii="Times New Roman" w:hAnsi="Times New Roman" w:eastAsia="Times New Roman" w:cs="Times New Roman"/>
+          <w:color w:val="000000"/>
+          <w:lang w:val="en-US"/>
+        </w:rPr>
+        <w:t xml:space="preserve">{totalCostCents}</w:t>
+      </w:r>
+      <w:r>
+        <w:rPr>
+          <w:rFonts w:ascii="Times New Roman" w:hAnsi="Times New Roman" w:eastAsia="Times New Roman" w:cs="Times New Roman"/>
+          <w:color w:val="000000"/>
+        </w:rPr>
+        <w:t xml:space="preserve"> </w:t>
       </w:r>
       <w:r>
         <w:rPr>
@@ -35788,7 +35818,7 @@
     <customSectPr/>
   </customSectProps>
   <customShpExts>
-    <customShpInfo spid="_x005F_x005F_x005F_x005F_x005F_x005F_x005F_x005F_x005F_x005F_x005F_x005F_x005F_x005F_x005F_x005F_x005F_x005F_x005F_x005F_x005F_x005F_x005F_x005F_x005F_x005F_x005F_x005F_x005F_x005F_x005F_x005F_x005F_x005F_x005F_x005F_x005F_x005F_x005F_x005F_x005F_x005F_x005F_x005F_x005F_x005F_x005F_x005F_x005F_x005F_x005F_x005F_x005F_x005F_x005F_x005F_x005F_x005F_x005F_x005F_x005F_x005F_x005F_x0000_s1026" textRotate="1"/>
+    <customShpInfo spid="_x005F_x005F_x005F_x005F_x005F_x005F_x005F_x005F_x005F_x005F_x005F_x005F_x005F_x005F_x005F_x005F_x005F_x005F_x005F_x005F_x005F_x005F_x005F_x005F_x005F_x005F_x005F_x005F_x005F_x005F_x005F_x005F_x005F_x005F_x005F_x005F_x005F_x005F_x005F_x005F_x005F_x005F_x005F_x005F_x005F_x005F_x005F_x005F_x005F_x005F_x005F_x005F_x005F_x005F_x005F_x005F_x005F_x005F_x005F_x005F_x005F_x005F_x005F_x005F_x005F_x005F_x005F_x005F_x005F_x005F_x005F_x005F_x005F_x005F_x005F_x005F_x005F_x005F_x005F_x005F_x005F_x005F_x005F_x005F_x005F_x005F_x005F_x005F_x005F_x005F_x005F_x005F_x005F_x005F_x005F_x005F_x005F_x005F_x005F_x005F_x005F_x005F_x005F_x005F_x005F_x005F_x005F_x005F_x005F_x005F_x005F_x005F_x005F_x005F_x005F_x005F_x005F_x005F_x005F_x005F_x005F_x005F_x005F_x005F_x005F_x005F_x005F_x005F_x005F_x005F_x005F_x005F_x005F_x005F_x005F_x005F_x005F_x005F_x005F_x005F_x005F_x005F_x005F_x005F_x005F_x005F_x005F_x005F_x005F_x005F_x005F_x005F_x005F_x005F_x005F_x005F_x005F_x005F_x005F_x005F_x005F_x005F_x005F_x005F_x005F_x005F_x005F_x005F_x005F_x005F_x005F_x005F_x005F_x005F_x005F_x005F_x005F_x005F_x005F_x005F_x005F_x005F_x005F_x005F_x005F_x005F_x005F_x005F_x005F_x005F_x005F_x005F_x005F_x005F_x005F_x005F_x005F_x005F_x005F_x005F_x005F_x005F_x005F_x005F_x005F_x005F_x005F_x005F_x005F_x005F_x005F_x005F_x005F_x005F_x005F_x005F_x005F_x005F_x005F_x005F_x005F_x005F_x005F_x005F_x005F_x005F_x005F_x005F_x005F_x005F_x005F_x005F_x005F_x005F_x005F_x005F_x005F_x005F_x005F_x005F_x005F_x005F_x005F_x005F_x005F_x005F_x005F_x005F_x005F_x005F_x005F_x005F_x005F_x005F_x005F_x0000_s1026" textRotate="1"/>
   </customShpExts>
 </s:customData>
 </file>

</xml_diff>